<commit_message>
Deploying to gh-pages from @ Morrison-Lab/psw@18ee90c54a39950cc68702e716610fddfda0f316 🚀
</commit_message>
<xml_diff>
--- a/chapters/intro.docx
+++ b/chapters/intro.docx
@@ -15,7 +15,7 @@
         <w:pStyle w:val="Date"/>
       </w:pPr>
       <w:r>
-        <w:t xml:space="preserve">Last modified: 2026-10-08 23:04:55 (UTC)</w:t>
+        <w:t xml:space="preserve">Last modified: 2026-10-08 18:54:45 (PDT)</w:t>
       </w:r>
     </w:p>
     <w:tbl>
@@ -152,6 +152,733 @@
         </w:tc>
       </w:tr>
     </w:tbl>
+    <w:p>
+      <w:pPr>
+        <w:pStyle w:val="BodyText"/>
+      </w:pPr>
+      <w:r>
+        <w:t xml:space="preserve">This book is a style guide for writing in science, technology,</w:t>
+      </w:r>
+      <w:r>
+        <w:t xml:space="preserve"> </w:t>
+      </w:r>
+      <w:r>
+        <w:t xml:space="preserve">engineering, and mathematics (STEM).</w:t>
+      </w:r>
+      <w:r>
+        <w:t xml:space="preserve"> </w:t>
+      </w:r>
+      <w:r>
+        <w:t xml:space="preserve">Most of its examples come from statistics and data analysis,</w:t>
+      </w:r>
+      <w:r>
+        <w:t xml:space="preserve"> </w:t>
+      </w:r>
+      <w:r>
+        <w:t xml:space="preserve">because statistics and data analysis are the fields that I work in.</w:t>
+      </w:r>
+      <w:r>
+        <w:t xml:space="preserve"> </w:t>
+      </w:r>
+      <w:r>
+        <w:t xml:space="preserve">Most of its rules apply to any writing that explains technical ideas.</w:t>
+      </w:r>
+    </w:p>
+    <w:bookmarkStart w:id="15" w:name="what-the-book-covers"/>
+    <w:p>
+      <w:pPr>
+        <w:pStyle w:val="Heading2"/>
+      </w:pPr>
+      <w:r>
+        <w:t xml:space="preserve">1 What the book covers</w:t>
+      </w:r>
+    </w:p>
+    <w:p>
+      <w:pPr>
+        <w:pStyle w:val="FirstParagraph"/>
+      </w:pPr>
+      <w:r>
+        <w:t xml:space="preserve">Most chapters give rules for every kind of technical writing,</w:t>
+      </w:r>
+      <w:r>
+        <w:t xml:space="preserve"> </w:t>
+      </w:r>
+      <w:r>
+        <w:t xml:space="preserve">such as a paper or a set of lecture notes.</w:t>
+      </w:r>
+      <w:r>
+        <w:t xml:space="preserve"> </w:t>
+      </w:r>
+      <w:r>
+        <w:t xml:space="preserve">Three chapters cover one kind of document:</w:t>
+      </w:r>
+    </w:p>
+    <w:p>
+      <w:pPr>
+        <w:pStyle w:val="Compact"/>
+        <w:numPr>
+          <w:ilvl w:val="0"/>
+          <w:numId w:val="1001"/>
+        </w:numPr>
+      </w:pPr>
+      <w:hyperlink r:id="rId12">
+        <w:r>
+          <w:rPr>
+            <w:rStyle w:val="Hyperlink"/>
+          </w:rPr>
+          <w:t xml:space="preserve">Paper organization</w:t>
+        </w:r>
+      </w:hyperlink>
+      <w:r>
+        <w:t xml:space="preserve"> </w:t>
+      </w:r>
+      <w:r>
+        <w:t xml:space="preserve">and</w:t>
+      </w:r>
+      <w:r>
+        <w:t xml:space="preserve"> </w:t>
+      </w:r>
+      <w:hyperlink r:id="rId13">
+        <w:r>
+          <w:rPr>
+            <w:rStyle w:val="Hyperlink"/>
+          </w:rPr>
+          <w:t xml:space="preserve">Preparing a manuscript for submission</w:t>
+        </w:r>
+      </w:hyperlink>
+      <w:r>
+        <w:t xml:space="preserve"> </w:t>
+      </w:r>
+      <w:r>
+        <w:t xml:space="preserve">cover research papers.</w:t>
+      </w:r>
+    </w:p>
+    <w:p>
+      <w:pPr>
+        <w:pStyle w:val="Compact"/>
+        <w:numPr>
+          <w:ilvl w:val="0"/>
+          <w:numId w:val="1001"/>
+        </w:numPr>
+      </w:pPr>
+      <w:hyperlink r:id="rId14">
+        <w:r>
+          <w:rPr>
+            <w:rStyle w:val="Hyperlink"/>
+          </w:rPr>
+          <w:t xml:space="preserve">Writing for teaching</w:t>
+        </w:r>
+      </w:hyperlink>
+      <w:r>
+        <w:t xml:space="preserve"> </w:t>
+      </w:r>
+      <w:r>
+        <w:t xml:space="preserve">covers lecture notes, slides, and problem sets.</w:t>
+      </w:r>
+    </w:p>
+    <w:bookmarkEnd w:id="15"/>
+    <w:bookmarkStart w:id="17" w:name="who-the-book-is-for"/>
+    <w:p>
+      <w:pPr>
+        <w:pStyle w:val="Heading2"/>
+      </w:pPr>
+      <w:r>
+        <w:t xml:space="preserve">2 Who the book is for</w:t>
+      </w:r>
+    </w:p>
+    <w:p>
+      <w:pPr>
+        <w:pStyle w:val="FirstParagraph"/>
+      </w:pPr>
+      <w:r>
+        <w:t xml:space="preserve">I wrote this book for students and mentees</w:t>
+      </w:r>
+      <w:r>
+        <w:t xml:space="preserve"> </w:t>
+      </w:r>
+      <w:r>
+        <w:t xml:space="preserve">who are learning to write about their research.</w:t>
+      </w:r>
+      <w:r>
+        <w:t xml:space="preserve"> </w:t>
+      </w:r>
+      <w:r>
+        <w:t xml:space="preserve">I also wrote it for the AI writing assistants</w:t>
+      </w:r>
+      <w:r>
+        <w:t xml:space="preserve"> </w:t>
+      </w:r>
+      <w:r>
+        <w:t xml:space="preserve">that draft and edit prose for me.</w:t>
+      </w:r>
+    </w:p>
+    <w:p>
+      <w:pPr>
+        <w:pStyle w:val="BodyText"/>
+      </w:pPr>
+      <w:r>
+        <w:t xml:space="preserve">Many rules are stated as checks</w:t>
+      </w:r>
+      <w:r>
+        <w:t xml:space="preserve"> </w:t>
+      </w:r>
+      <w:r>
+        <w:t xml:space="preserve">that a reader can apply to a single sentence,</w:t>
+      </w:r>
+      <w:r>
+        <w:t xml:space="preserve"> </w:t>
+      </w:r>
+      <w:r>
+        <w:t xml:space="preserve">so a student and an AI assistant can apply them the same way.</w:t>
+      </w:r>
+      <w:r>
+        <w:t xml:space="preserve"> </w:t>
+      </w:r>
+      <w:r>
+        <w:t xml:space="preserve">For example,</w:t>
+      </w:r>
+      <w:r>
+        <w:t xml:space="preserve"> </w:t>
+      </w:r>
+      <w:r>
+        <w:t xml:space="preserve">the section on</w:t>
+      </w:r>
+      <w:r>
+        <w:t xml:space="preserve"> </w:t>
+      </w:r>
+      <w:hyperlink r:id="rId16">
+        <w:r>
+          <w:rPr>
+            <w:rStyle w:val="Hyperlink"/>
+          </w:rPr>
+          <w:t xml:space="preserve">demonstrative pronouns</w:t>
+        </w:r>
+      </w:hyperlink>
+      <w:r>
+        <w:t xml:space="preserve"> </w:t>
+      </w:r>
+      <w:r>
+        <w:t xml:space="preserve">asks whether each</w:t>
+      </w:r>
+      <w:r>
+        <w:t xml:space="preserve"> </w:t>
+      </w:r>
+      <w:r>
+        <w:t xml:space="preserve">“this”</w:t>
+      </w:r>
+      <w:r>
+        <w:t xml:space="preserve"> </w:t>
+      </w:r>
+      <w:r>
+        <w:t xml:space="preserve">or</w:t>
+      </w:r>
+      <w:r>
+        <w:t xml:space="preserve"> </w:t>
+      </w:r>
+      <w:r>
+        <w:t xml:space="preserve">“that”</w:t>
+      </w:r>
+      <w:r>
+        <w:t xml:space="preserve"> </w:t>
+      </w:r>
+      <w:r>
+        <w:t xml:space="preserve">is followed by the noun that it refers to.</w:t>
+      </w:r>
+      <w:r>
+        <w:t xml:space="preserve"> </w:t>
+      </w:r>
+      <w:r>
+        <w:t xml:space="preserve">A person or a program can answer that question</w:t>
+      </w:r>
+      <w:r>
+        <w:t xml:space="preserve"> </w:t>
+      </w:r>
+      <w:r>
+        <w:t xml:space="preserve">without knowing what the paper is about.</w:t>
+      </w:r>
+    </w:p>
+    <w:bookmarkEnd w:id="17"/>
+    <w:bookmarkStart w:id="27" w:name="how-the-book-is-organized"/>
+    <w:p>
+      <w:pPr>
+        <w:pStyle w:val="Heading2"/>
+      </w:pPr>
+      <w:r>
+        <w:t xml:space="preserve">3 How the book is organized</w:t>
+      </w:r>
+    </w:p>
+    <w:p>
+      <w:pPr>
+        <w:pStyle w:val="FirstParagraph"/>
+      </w:pPr>
+      <w:r>
+        <w:t xml:space="preserve">The chapters fall into four groups:</w:t>
+      </w:r>
+    </w:p>
+    <w:p>
+      <w:pPr>
+        <w:pStyle w:val="Compact"/>
+        <w:numPr>
+          <w:ilvl w:val="0"/>
+          <w:numId w:val="1002"/>
+        </w:numPr>
+      </w:pPr>
+      <w:r>
+        <w:t xml:space="preserve">Terms, notation, and evidence:</w:t>
+      </w:r>
+    </w:p>
+    <w:p>
+      <w:pPr>
+        <w:pStyle w:val="Compact"/>
+        <w:numPr>
+          <w:ilvl w:val="1"/>
+          <w:numId w:val="1003"/>
+        </w:numPr>
+      </w:pPr>
+      <w:hyperlink r:id="rId18">
+        <w:r>
+          <w:rPr>
+            <w:rStyle w:val="Hyperlink"/>
+          </w:rPr>
+          <w:t xml:space="preserve">Defining terms clearly</w:t>
+        </w:r>
+      </w:hyperlink>
+    </w:p>
+    <w:p>
+      <w:pPr>
+        <w:pStyle w:val="Compact"/>
+        <w:numPr>
+          <w:ilvl w:val="1"/>
+          <w:numId w:val="1003"/>
+        </w:numPr>
+      </w:pPr>
+      <w:hyperlink r:id="rId19">
+        <w:r>
+          <w:rPr>
+            <w:rStyle w:val="Hyperlink"/>
+          </w:rPr>
+          <w:t xml:space="preserve">Mathematical notation</w:t>
+        </w:r>
+      </w:hyperlink>
+    </w:p>
+    <w:p>
+      <w:pPr>
+        <w:pStyle w:val="Compact"/>
+        <w:numPr>
+          <w:ilvl w:val="1"/>
+          <w:numId w:val="1003"/>
+        </w:numPr>
+      </w:pPr>
+      <w:hyperlink r:id="rId20">
+        <w:r>
+          <w:rPr>
+            <w:rStyle w:val="Hyperlink"/>
+          </w:rPr>
+          <w:t xml:space="preserve">Citations and evidence</w:t>
+        </w:r>
+      </w:hyperlink>
+    </w:p>
+    <w:p>
+      <w:pPr>
+        <w:pStyle w:val="Compact"/>
+        <w:numPr>
+          <w:ilvl w:val="0"/>
+          <w:numId w:val="1002"/>
+        </w:numPr>
+      </w:pPr>
+      <w:r>
+        <w:t xml:space="preserve">Papers:</w:t>
+      </w:r>
+    </w:p>
+    <w:p>
+      <w:pPr>
+        <w:pStyle w:val="Compact"/>
+        <w:numPr>
+          <w:ilvl w:val="1"/>
+          <w:numId w:val="1004"/>
+        </w:numPr>
+      </w:pPr>
+      <w:hyperlink r:id="rId12">
+        <w:r>
+          <w:rPr>
+            <w:rStyle w:val="Hyperlink"/>
+          </w:rPr>
+          <w:t xml:space="preserve">Paper organization</w:t>
+        </w:r>
+      </w:hyperlink>
+    </w:p>
+    <w:p>
+      <w:pPr>
+        <w:pStyle w:val="Compact"/>
+        <w:numPr>
+          <w:ilvl w:val="1"/>
+          <w:numId w:val="1004"/>
+        </w:numPr>
+      </w:pPr>
+      <w:hyperlink r:id="rId13">
+        <w:r>
+          <w:rPr>
+            <w:rStyle w:val="Hyperlink"/>
+          </w:rPr>
+          <w:t xml:space="preserve">Preparing a manuscript for submission</w:t>
+        </w:r>
+      </w:hyperlink>
+    </w:p>
+    <w:p>
+      <w:pPr>
+        <w:pStyle w:val="Compact"/>
+        <w:numPr>
+          <w:ilvl w:val="0"/>
+          <w:numId w:val="1002"/>
+        </w:numPr>
+      </w:pPr>
+      <w:r>
+        <w:t xml:space="preserve">Words and sentences:</w:t>
+      </w:r>
+    </w:p>
+    <w:p>
+      <w:pPr>
+        <w:pStyle w:val="Compact"/>
+        <w:numPr>
+          <w:ilvl w:val="1"/>
+          <w:numId w:val="1005"/>
+        </w:numPr>
+      </w:pPr>
+      <w:hyperlink r:id="rId21">
+        <w:r>
+          <w:rPr>
+            <w:rStyle w:val="Hyperlink"/>
+          </w:rPr>
+          <w:t xml:space="preserve">Word choice</w:t>
+        </w:r>
+      </w:hyperlink>
+    </w:p>
+    <w:p>
+      <w:pPr>
+        <w:pStyle w:val="Compact"/>
+        <w:numPr>
+          <w:ilvl w:val="1"/>
+          <w:numId w:val="1005"/>
+        </w:numPr>
+      </w:pPr>
+      <w:hyperlink r:id="rId22">
+        <w:r>
+          <w:rPr>
+            <w:rStyle w:val="Hyperlink"/>
+          </w:rPr>
+          <w:t xml:space="preserve">Writing for every reader</w:t>
+        </w:r>
+      </w:hyperlink>
+    </w:p>
+    <w:p>
+      <w:pPr>
+        <w:pStyle w:val="Compact"/>
+        <w:numPr>
+          <w:ilvl w:val="1"/>
+          <w:numId w:val="1005"/>
+        </w:numPr>
+      </w:pPr>
+      <w:hyperlink r:id="rId23">
+        <w:r>
+          <w:rPr>
+            <w:rStyle w:val="Hyperlink"/>
+          </w:rPr>
+          <w:t xml:space="preserve">Avoiding AI tells</w:t>
+        </w:r>
+      </w:hyperlink>
+    </w:p>
+    <w:p>
+      <w:pPr>
+        <w:pStyle w:val="Compact"/>
+        <w:numPr>
+          <w:ilvl w:val="1"/>
+          <w:numId w:val="1005"/>
+        </w:numPr>
+      </w:pPr>
+      <w:hyperlink r:id="rId24">
+        <w:r>
+          <w:rPr>
+            <w:rStyle w:val="Hyperlink"/>
+          </w:rPr>
+          <w:t xml:space="preserve">Grammar</w:t>
+        </w:r>
+      </w:hyperlink>
+    </w:p>
+    <w:p>
+      <w:pPr>
+        <w:pStyle w:val="Compact"/>
+        <w:numPr>
+          <w:ilvl w:val="1"/>
+          <w:numId w:val="1005"/>
+        </w:numPr>
+      </w:pPr>
+      <w:hyperlink r:id="rId25">
+        <w:r>
+          <w:rPr>
+            <w:rStyle w:val="Hyperlink"/>
+          </w:rPr>
+          <w:t xml:space="preserve">Conciseness</w:t>
+        </w:r>
+      </w:hyperlink>
+    </w:p>
+    <w:p>
+      <w:pPr>
+        <w:pStyle w:val="Compact"/>
+        <w:numPr>
+          <w:ilvl w:val="0"/>
+          <w:numId w:val="1002"/>
+        </w:numPr>
+      </w:pPr>
+      <w:r>
+        <w:t xml:space="preserve">Teaching:</w:t>
+      </w:r>
+    </w:p>
+    <w:p>
+      <w:pPr>
+        <w:pStyle w:val="Compact"/>
+        <w:numPr>
+          <w:ilvl w:val="1"/>
+          <w:numId w:val="1006"/>
+        </w:numPr>
+      </w:pPr>
+      <w:hyperlink r:id="rId14">
+        <w:r>
+          <w:rPr>
+            <w:rStyle w:val="Hyperlink"/>
+          </w:rPr>
+          <w:t xml:space="preserve">Writing for teaching</w:t>
+        </w:r>
+      </w:hyperlink>
+    </w:p>
+    <w:p>
+      <w:pPr>
+        <w:pStyle w:val="FirstParagraph"/>
+      </w:pPr>
+      <w:r>
+        <w:t xml:space="preserve">The</w:t>
+      </w:r>
+      <w:r>
+        <w:t xml:space="preserve"> </w:t>
+      </w:r>
+      <w:hyperlink r:id="rId26">
+        <w:r>
+          <w:rPr>
+            <w:rStyle w:val="Hyperlink"/>
+          </w:rPr>
+          <w:t xml:space="preserve">Summary</w:t>
+        </w:r>
+      </w:hyperlink>
+      <w:r>
+        <w:t xml:space="preserve"> </w:t>
+      </w:r>
+      <w:r>
+        <w:t xml:space="preserve">lists the book’s main rules</w:t>
+      </w:r>
+      <w:r>
+        <w:t xml:space="preserve"> </w:t>
+      </w:r>
+      <w:r>
+        <w:t xml:space="preserve">as a checklist for revising a draft.</w:t>
+      </w:r>
+    </w:p>
+    <w:bookmarkEnd w:id="27"/>
+    <w:bookmarkStart w:id="28" w:name="how-to-read-the-book"/>
+    <w:p>
+      <w:pPr>
+        <w:pStyle w:val="Heading2"/>
+      </w:pPr>
+      <w:r>
+        <w:t xml:space="preserve">4 How to read the book</w:t>
+      </w:r>
+    </w:p>
+    <w:p>
+      <w:pPr>
+        <w:pStyle w:val="FirstParagraph"/>
+      </w:pPr>
+      <w:r>
+        <w:t xml:space="preserve">You do not need to read the chapters in order.</w:t>
+      </w:r>
+      <w:r>
+        <w:t xml:space="preserve"> </w:t>
+      </w:r>
+      <w:r>
+        <w:t xml:space="preserve">Most sections state one rule and the reason for it,</w:t>
+      </w:r>
+      <w:r>
+        <w:t xml:space="preserve"> </w:t>
+      </w:r>
+      <w:r>
+        <w:t xml:space="preserve">and then show the rule applied to an example.</w:t>
+      </w:r>
+      <w:r>
+        <w:t xml:space="preserve"> </w:t>
+      </w:r>
+      <w:r>
+        <w:t xml:space="preserve">Many sections compare a weaker version of a passage with a stronger one.</w:t>
+      </w:r>
+      <w:r>
+        <w:t xml:space="preserve"> </w:t>
+      </w:r>
+      <w:r>
+        <w:t xml:space="preserve">For example,</w:t>
+      </w:r>
+      <w:r>
+        <w:t xml:space="preserve"> </w:t>
+      </w:r>
+      <w:r>
+        <w:t xml:space="preserve">the</w:t>
+      </w:r>
+      <w:r>
+        <w:t xml:space="preserve"> </w:t>
+      </w:r>
+      <w:hyperlink r:id="rId21">
+        <w:r>
+          <w:rPr>
+            <w:rStyle w:val="Hyperlink"/>
+          </w:rPr>
+          <w:t xml:space="preserve">Word choice</w:t>
+        </w:r>
+      </w:hyperlink>
+      <w:r>
+        <w:t xml:space="preserve"> </w:t>
+      </w:r>
+      <w:r>
+        <w:t xml:space="preserve">chapter</w:t>
+      </w:r>
+      <w:r>
+        <w:t xml:space="preserve"> </w:t>
+      </w:r>
+      <w:r>
+        <w:t xml:space="preserve">recommends</w:t>
+      </w:r>
+      <w:r>
+        <w:t xml:space="preserve"> </w:t>
+      </w:r>
+      <w:r>
+        <w:t xml:space="preserve">“before”</w:t>
+      </w:r>
+      <w:r>
+        <w:t xml:space="preserve"> </w:t>
+      </w:r>
+      <w:r>
+        <w:t xml:space="preserve">over</w:t>
+      </w:r>
+      <w:r>
+        <w:t xml:space="preserve"> </w:t>
+      </w:r>
+      <w:r>
+        <w:t xml:space="preserve">“prior to”</w:t>
+      </w:r>
+      <w:r>
+        <w:t xml:space="preserve">:</w:t>
+      </w:r>
+    </w:p>
+    <w:p>
+      <w:pPr>
+        <w:pStyle w:val="BlockText"/>
+      </w:pPr>
+      <w:r>
+        <w:t xml:space="preserve">❌ Prior to fitting the model, we removed outliers.</w:t>
+      </w:r>
+    </w:p>
+    <w:p>
+      <w:pPr>
+        <w:pStyle w:val="BlockText"/>
+      </w:pPr>
+      <w:r>
+        <w:t xml:space="preserve">✅ We removed outliers before fitting the model.</w:t>
+      </w:r>
+    </w:p>
+    <w:p>
+      <w:pPr>
+        <w:pStyle w:val="FirstParagraph"/>
+      </w:pPr>
+      <w:r>
+        <w:t xml:space="preserve">Definitions, examples, and exercises appear in numbered, colored boxes,</w:t>
+      </w:r>
+      <w:r>
+        <w:t xml:space="preserve"> </w:t>
+      </w:r>
+      <w:r>
+        <w:t xml:space="preserve">so that other sections and other documents can link to them.</w:t>
+      </w:r>
+    </w:p>
+    <w:p>
+      <w:pPr>
+        <w:pStyle w:val="BodyText"/>
+      </w:pPr>
+      <w:r>
+        <w:t xml:space="preserve">Use the book as a reference while you write,</w:t>
+      </w:r>
+      <w:r>
+        <w:t xml:space="preserve"> </w:t>
+      </w:r>
+      <w:r>
+        <w:t xml:space="preserve">and use the</w:t>
+      </w:r>
+      <w:r>
+        <w:t xml:space="preserve"> </w:t>
+      </w:r>
+      <w:hyperlink r:id="rId26">
+        <w:r>
+          <w:rPr>
+            <w:rStyle w:val="Hyperlink"/>
+          </w:rPr>
+          <w:t xml:space="preserve">Summary</w:t>
+        </w:r>
+      </w:hyperlink>
+      <w:r>
+        <w:t xml:space="preserve"> </w:t>
+      </w:r>
+      <w:r>
+        <w:t xml:space="preserve">checklist when you revise.</w:t>
+      </w:r>
+    </w:p>
+    <w:bookmarkEnd w:id="28"/>
+    <w:bookmarkStart w:id="30" w:name="contributing"/>
+    <w:p>
+      <w:pPr>
+        <w:pStyle w:val="Heading2"/>
+      </w:pPr>
+      <w:r>
+        <w:t xml:space="preserve">5 Contributing</w:t>
+      </w:r>
+    </w:p>
+    <w:p>
+      <w:pPr>
+        <w:pStyle w:val="FirstParagraph"/>
+      </w:pPr>
+      <w:r>
+        <w:t xml:space="preserve">The book is a work in progress.</w:t>
+      </w:r>
+      <w:r>
+        <w:t xml:space="preserve"> </w:t>
+      </w:r>
+      <w:r>
+        <w:t xml:space="preserve">If a rule is unclear, wrong, or missing,</w:t>
+      </w:r>
+      <w:r>
+        <w:t xml:space="preserve"> </w:t>
+      </w:r>
+      <w:r>
+        <w:t xml:space="preserve">open an issue on the book’s</w:t>
+      </w:r>
+      <w:r>
+        <w:t xml:space="preserve"> </w:t>
+      </w:r>
+      <w:hyperlink r:id="rId29">
+        <w:r>
+          <w:rPr>
+            <w:rStyle w:val="Hyperlink"/>
+          </w:rPr>
+          <w:t xml:space="preserve">GitHub repository</w:t>
+        </w:r>
+      </w:hyperlink>
+      <w:r>
+        <w:t xml:space="preserve">.</w:t>
+      </w:r>
+    </w:p>
+    <w:bookmarkEnd w:id="30"/>
     <w:sectPr>
       <w:footnotePr>
         <w:numRestart w:val="eachSect"/>
@@ -262,8 +989,129 @@
       </w:pPr>
     </w:lvl>
   </w:abstractNum>
+  <w:abstractNum w:abstractNumId="991">
+    <w:nsid w:val="0000A991"/>
+    <w:multiLevelType w:val="multilevel"/>
+    <w:lvl w:ilvl="0">
+      <w:numFmt w:val="bullet"/>
+      <w:lvlText w:val=""/>
+      <w:lvlJc w:val="left"/>
+      <w:pPr>
+        <w:ind w:left="720" w:hanging="360"/>
+      </w:pPr>
+      <w:rPr>
+        <w:rFonts w:ascii="Symbol" w:hAnsi="Symbol" w:cs="Symbol" w:hint="default"/>
+      </w:rPr>
+    </w:lvl>
+    <w:lvl w:ilvl="1">
+      <w:numFmt w:val="bullet"/>
+      <w:lvlText w:val="o"/>
+      <w:lvlJc w:val="left"/>
+      <w:pPr>
+        <w:ind w:left="1440" w:hanging="360"/>
+      </w:pPr>
+      <w:rPr>
+        <w:rFonts w:ascii="Courier New" w:hAnsi="Courier New" w:cs="Courier New" w:hint="default"/>
+      </w:rPr>
+    </w:lvl>
+    <w:lvl w:ilvl="2">
+      <w:numFmt w:val="bullet"/>
+      <w:lvlText w:val=""/>
+      <w:lvlJc w:val="left"/>
+      <w:pPr>
+        <w:ind w:left="2160" w:hanging="360"/>
+      </w:pPr>
+      <w:rPr>
+        <w:rFonts w:ascii="Wingdings" w:hAnsi="Wingdings" w:cs="Wingdings" w:hint="default"/>
+      </w:rPr>
+    </w:lvl>
+    <w:lvl w:ilvl="3">
+      <w:numFmt w:val="bullet"/>
+      <w:lvlText w:val=""/>
+      <w:lvlJc w:val="left"/>
+      <w:pPr>
+        <w:ind w:left="2880" w:hanging="360"/>
+      </w:pPr>
+      <w:rPr>
+        <w:rFonts w:ascii="Symbol" w:hAnsi="Symbol" w:cs="Symbol" w:hint="default"/>
+      </w:rPr>
+    </w:lvl>
+    <w:lvl w:ilvl="4">
+      <w:numFmt w:val="bullet"/>
+      <w:lvlText w:val="o"/>
+      <w:lvlJc w:val="left"/>
+      <w:pPr>
+        <w:ind w:left="3600" w:hanging="360"/>
+      </w:pPr>
+      <w:rPr>
+        <w:rFonts w:ascii="Courier New" w:hAnsi="Courier New" w:cs="Courier New" w:hint="default"/>
+      </w:rPr>
+    </w:lvl>
+    <w:lvl w:ilvl="5">
+      <w:numFmt w:val="bullet"/>
+      <w:lvlText w:val=""/>
+      <w:lvlJc w:val="left"/>
+      <w:pPr>
+        <w:ind w:left="4320" w:hanging="360"/>
+      </w:pPr>
+      <w:rPr>
+        <w:rFonts w:ascii="Wingdings" w:hAnsi="Wingdings" w:cs="Wingdings" w:hint="default"/>
+      </w:rPr>
+    </w:lvl>
+    <w:lvl w:ilvl="6">
+      <w:numFmt w:val="bullet"/>
+      <w:lvlText w:val=""/>
+      <w:lvlJc w:val="left"/>
+      <w:pPr>
+        <w:ind w:left="5040" w:hanging="360"/>
+      </w:pPr>
+      <w:rPr>
+        <w:rFonts w:ascii="Symbol" w:hAnsi="Symbol" w:cs="Symbol" w:hint="default"/>
+      </w:rPr>
+    </w:lvl>
+    <w:lvl w:ilvl="7">
+      <w:numFmt w:val="bullet"/>
+      <w:lvlText w:val="o"/>
+      <w:lvlJc w:val="left"/>
+      <w:pPr>
+        <w:ind w:left="5760" w:hanging="360"/>
+      </w:pPr>
+      <w:rPr>
+        <w:rFonts w:ascii="Courier New" w:hAnsi="Courier New" w:cs="Courier New" w:hint="default"/>
+      </w:rPr>
+    </w:lvl>
+    <w:lvl w:ilvl="8">
+      <w:numFmt w:val="bullet"/>
+      <w:lvlText w:val=""/>
+      <w:lvlJc w:val="left"/>
+      <w:pPr>
+        <w:ind w:left="6480" w:hanging="360"/>
+      </w:pPr>
+      <w:rPr>
+        <w:rFonts w:ascii="Wingdings" w:hAnsi="Wingdings" w:cs="Wingdings" w:hint="default"/>
+      </w:rPr>
+    </w:lvl>
+  </w:abstractNum>
   <w:num w:numId="1000">
     <w:abstractNumId w:val="990"/>
+  </w:num>
+  <w:num w:numId="1001">
+    <w:abstractNumId w:val="991"/>
+  </w:num>
+  <w:num w:numId="1002">
+    <w:abstractNumId w:val="991"/>
+  </w:num>
+  <w:num w:numId="1003">
+    <w:abstractNumId w:val="991"/>
+  </w:num>
+  <w:num w:numId="1004">
+    <w:abstractNumId w:val="991"/>
+  </w:num>
+  <w:num w:numId="1005">
+    <w:abstractNumId w:val="991"/>
+  </w:num>
+  <w:num w:numId="1006">
+    <w:abstractNumId w:val="991"/>
   </w:num>
 </w:numbering>
 </file>

</xml_diff>

<commit_message>
Deploying to gh-pages from @ Morrison-Lab/psw@28eceeaed4034c41a011da17bd33e71bcc424ba4 🚀
</commit_message>
<xml_diff>
--- a/chapters/intro.docx
+++ b/chapters/intro.docx
@@ -15,7 +15,7 @@
         <w:pStyle w:val="Date"/>
       </w:pPr>
       <w:r>
-        <w:t xml:space="preserve">Last modified: 2026-10-11 20:42:52 (PDT)</w:t>
+        <w:t xml:space="preserve">Last modified: 2026-10-12 00:36:15 (PDT)</w:t>
       </w:r>
     </w:p>
     <w:tbl>
@@ -835,13 +835,13 @@
       </w:r>
     </w:p>
     <w:bookmarkEnd w:id="28"/>
-    <w:bookmarkStart w:id="30" w:name="contributing"/>
+    <w:bookmarkStart w:id="34" w:name="sec-further-reading"/>
     <w:p>
       <w:pPr>
         <w:pStyle w:val="Heading2"/>
       </w:pPr>
       <w:r>
-        <w:t xml:space="preserve">5 Contributing</w:t>
+        <w:t xml:space="preserve">5 Further reading</w:t>
       </w:r>
     </w:p>
     <w:p>
@@ -849,6 +849,307 @@
         <w:pStyle w:val="FirstParagraph"/>
       </w:pPr>
       <w:r>
+        <w:t xml:space="preserve">These shorter guides cover some of the same ground:</w:t>
+      </w:r>
+    </w:p>
+    <w:p>
+      <w:pPr>
+        <w:pStyle w:val="Compact"/>
+        <w:numPr>
+          <w:ilvl w:val="0"/>
+          <w:numId w:val="1007"/>
+        </w:numPr>
+      </w:pPr>
+      <w:r>
+        <w:t xml:space="preserve">Novelist Cormac McCarthy’s tips on how to write a great science paper</w:t>
+      </w:r>
+      <w:r>
+        <w:t xml:space="preserve"> </w:t>
+      </w:r>
+      <w:r>
+        <w:t xml:space="preserve">(Savage and Yeh 2019)</w:t>
+      </w:r>
+    </w:p>
+    <w:p>
+      <w:pPr>
+        <w:pStyle w:val="Compact"/>
+        <w:numPr>
+          <w:ilvl w:val="0"/>
+          <w:numId w:val="1007"/>
+        </w:numPr>
+      </w:pPr>
+      <w:r>
+        <w:t xml:space="preserve">Elements of style</w:t>
+      </w:r>
+      <w:r>
+        <w:t xml:space="preserve"> </w:t>
+      </w:r>
+      <w:r>
+        <w:t xml:space="preserve">(Nature Physics 2007)</w:t>
+      </w:r>
+      <w:r>
+        <w:t xml:space="preserve"> </w:t>
+      </w:r>
+      <w:r>
+        <w:t xml:space="preserve">- a</w:t>
+      </w:r>
+      <w:r>
+        <w:t xml:space="preserve"> </w:t>
+      </w:r>
+      <w:r>
+        <w:rPr>
+          <w:i/>
+          <w:iCs/>
+        </w:rPr>
+        <w:t xml:space="preserve">Nature Physics</w:t>
+      </w:r>
+      <w:r>
+        <w:t xml:space="preserve"> </w:t>
+      </w:r>
+      <w:r>
+        <w:t xml:space="preserve">editorial on scientific writing</w:t>
+      </w:r>
+    </w:p>
+    <w:p>
+      <w:pPr>
+        <w:pStyle w:val="Compact"/>
+        <w:numPr>
+          <w:ilvl w:val="0"/>
+          <w:numId w:val="1007"/>
+        </w:numPr>
+      </w:pPr>
+      <w:r>
+        <w:t xml:space="preserve">The Pathway to Publishing: A Guide to Quantitative Writing in the Health Sciences</w:t>
+      </w:r>
+      <w:r>
+        <w:t xml:space="preserve"> </w:t>
+      </w:r>
+      <w:r>
+        <w:t xml:space="preserve">(Luby and Southern 2022)</w:t>
+      </w:r>
+    </w:p>
+    <w:p>
+      <w:pPr>
+        <w:pStyle w:val="Compact"/>
+        <w:numPr>
+          <w:ilvl w:val="0"/>
+          <w:numId w:val="1007"/>
+        </w:numPr>
+      </w:pPr>
+      <w:hyperlink r:id="rId29">
+        <w:r>
+          <w:rPr>
+            <w:rStyle w:val="Hyperlink"/>
+          </w:rPr>
+          <w:t xml:space="preserve">Secret, actionable writing tips</w:t>
+        </w:r>
+      </w:hyperlink>
+      <w:r>
+        <w:t xml:space="preserve"> </w:t>
+      </w:r>
+      <w:r>
+        <w:t xml:space="preserve">-</w:t>
+      </w:r>
+      <w:r>
+        <w:t xml:space="preserve"> </w:t>
+      </w:r>
+      <w:r>
+        <w:t xml:space="preserve">a thread on X</w:t>
+      </w:r>
+    </w:p>
+    <w:p>
+      <w:pPr>
+        <w:pStyle w:val="FirstParagraph"/>
+      </w:pPr>
+      <w:r>
+        <w:t xml:space="preserve">For who counts as an author, see the ICMJE criteria in</w:t>
+      </w:r>
+      <w:r>
+        <w:t xml:space="preserve"> </w:t>
+      </w:r>
+      <w:hyperlink r:id="rId13">
+        <w:r>
+          <w:rPr>
+            <w:rStyle w:val="Hyperlink"/>
+          </w:rPr>
+          <w:t xml:space="preserve">Preparing a manuscript for submission</w:t>
+        </w:r>
+      </w:hyperlink>
+      <w:r>
+        <w:t xml:space="preserve">.</w:t>
+      </w:r>
+    </w:p>
+    <w:tbl>
+      <w:tblPr>
+        <w:tblStyle w:val="Table"/>
+        <w:tblLook w:firstRow="0" w:lastRow="0" w:firstColumn="0" w:lastColumn="0" w:noHBand="0" w:noVBand="0" w:val="0000"/>
+        <w:tblBorders>
+          <w:top w:val="single" w:sz="4" w:space="0" w:color="0758E5"/>
+          <w:left w:val="single" w:sz="24" w:space="0" w:color="0758E5"/>
+          <w:bottom w:val="single" w:sz="4" w:space="0" w:color="0758E5"/>
+          <w:right w:val="single" w:sz="4" w:space="0" w:color="0758E5"/>
+        </w:tblBorders>
+        <w:tblCellMar>
+          <w:left w:w="144" w:type="dxa"/>
+          <w:right w:w="144" w:type="dxa"/>
+        </w:tblCellMar>
+        <w:tblLook w:firstRow="0" w:lastRow="0" w:firstColumn="0" w:lastColumn="0" w:noHBand="0" w:noVBand="0" w:val="0000"/>
+      </w:tblPr>
+      <w:tr>
+        <w:trPr>
+          <w:cantSplit/>
+        </w:trPr>
+        <w:tc>
+          <w:tcPr>
+            <w:shd w:color="auto" w:fill="dae6fb" w:val="clear"/>
+            <w:tcMar>
+              <w:top w:w="92" w:type="dxa"/>
+              <w:bottom w:w="92" w:type="dxa"/>
+            </w:tcMar>
+          </w:tcPr>
+          <w:p>
+            <w:pPr>
+              <w:pStyle w:val="BodyText"/>
+            </w:pPr>
+            <w:pPr>
+              <w:spacing w:before="0" w:after="0"/>
+              <w:textAlignment w:val="center"/>
+            </w:pPr>
+            <w:r>
+              <w:drawing>
+                <wp:inline>
+                  <wp:extent cx="152400" cy="152400"/>
+                  <wp:effectExtent b="0" l="0" r="0" t="0"/>
+                  <wp:docPr descr="" title="" id="30" name="Picture"/>
+                  <a:graphic>
+                    <a:graphicData uri="http://schemas.openxmlformats.org/drawingml/2006/picture">
+                      <pic:pic>
+                        <pic:nvPicPr>
+                          <pic:cNvPr descr="/opt/quarto/share/formats/docx/note.png" id="31" name="Picture"/>
+                          <pic:cNvPicPr>
+                            <a:picLocks noChangeArrowheads="1" noChangeAspect="1"/>
+                          </pic:cNvPicPr>
+                        </pic:nvPicPr>
+                        <pic:blipFill>
+                          <a:blip r:embed="rId9"/>
+                          <a:stretch>
+                            <a:fillRect/>
+                          </a:stretch>
+                        </pic:blipFill>
+                        <pic:spPr bwMode="auto">
+                          <a:xfrm>
+                            <a:off x="0" y="0"/>
+                            <a:ext cx="152400" cy="152400"/>
+                          </a:xfrm>
+                          <a:prstGeom prst="rect">
+                            <a:avLst/>
+                          </a:prstGeom>
+                          <a:noFill/>
+                          <a:ln w="9525">
+                            <a:noFill/>
+                            <a:headEnd/>
+                            <a:tailEnd/>
+                          </a:ln>
+                        </pic:spPr>
+                      </pic:pic>
+                    </a:graphicData>
+                  </a:graphic>
+                </wp:inline>
+              </w:drawing>
+            </w:r>
+            <w:r>
+              <w:t xml:space="preserve"> </w:t>
+            </w:r>
+            <w:r>
+              <w:t xml:space="preserve"> </w:t>
+            </w:r>
+            <w:r>
+              <w:t xml:space="preserve">Source</w:t>
+            </w:r>
+          </w:p>
+        </w:tc>
+      </w:tr>
+      <w:tr>
+        <w:trPr>
+          <w:cantSplit/>
+        </w:trPr>
+        <w:tc>
+          <w:tcPr>
+            <w:tcMar>
+              <w:top w:w="108" w:type="dxa"/>
+              <w:bottom w:w="108" w:type="dxa"/>
+            </w:tcMar>
+          </w:tcPr>
+          <w:p>
+            <w:pPr>
+              <w:pStyle w:val="BodyText"/>
+            </w:pPr>
+            <w:pPr>
+              <w:spacing w:before="16" w:after="16"/>
+            </w:pPr>
+            <w:r>
+              <w:t xml:space="preserve">This list began in the</w:t>
+            </w:r>
+            <w:r>
+              <w:t xml:space="preserve"> </w:t>
+            </w:r>
+            <w:hyperlink r:id="rId32">
+              <w:r>
+                <w:rPr>
+                  <w:rStyle w:val="Hyperlink"/>
+                </w:rPr>
+                <w:t xml:space="preserve">Resources chapter</w:t>
+              </w:r>
+            </w:hyperlink>
+            <w:r>
+              <w:t xml:space="preserve"> </w:t>
+            </w:r>
+            <w:r>
+              <w:t xml:space="preserve">of the UCD-SERG lab manual,</w:t>
+            </w:r>
+            <w:r>
+              <w:t xml:space="preserve"> </w:t>
+            </w:r>
+            <w:r>
+              <w:t xml:space="preserve">which adapted it from the</w:t>
+            </w:r>
+            <w:r>
+              <w:t xml:space="preserve"> </w:t>
+            </w:r>
+            <w:hyperlink r:id="rId33">
+              <w:r>
+                <w:rPr>
+                  <w:rStyle w:val="Hyperlink"/>
+                </w:rPr>
+                <w:t xml:space="preserve">Benjamin-Chung Lab Manual</w:t>
+              </w:r>
+            </w:hyperlink>
+            <w:r>
+              <w:t xml:space="preserve"> </w:t>
+            </w:r>
+            <w:r>
+              <w:t xml:space="preserve">by Jade Benjamin-Chung.</w:t>
+            </w:r>
+          </w:p>
+          <w:p/>
+        </w:tc>
+      </w:tr>
+    </w:tbl>
+    <w:bookmarkEnd w:id="34"/>
+    <w:bookmarkStart w:id="43" w:name="contributing"/>
+    <w:p>
+      <w:pPr>
+        <w:pStyle w:val="Heading2"/>
+      </w:pPr>
+      <w:r>
+        <w:t xml:space="preserve">6 Contributing</w:t>
+      </w:r>
+    </w:p>
+    <w:p>
+      <w:pPr>
+        <w:pStyle w:val="FirstParagraph"/>
+      </w:pPr>
+      <w:r>
         <w:t xml:space="preserve">The book is a work in progress.</w:t>
       </w:r>
       <w:r>
@@ -866,7 +1167,7 @@
       <w:r>
         <w:t xml:space="preserve"> </w:t>
       </w:r>
-      <w:hyperlink r:id="rId29">
+      <w:hyperlink r:id="rId35">
         <w:r>
           <w:rPr>
             <w:rStyle w:val="Hyperlink"/>
@@ -878,7 +1179,147 @@
         <w:t xml:space="preserve">.</w:t>
       </w:r>
     </w:p>
-    <w:bookmarkEnd w:id="30"/>
+    <w:bookmarkStart w:id="42" w:name="refs"/>
+    <w:bookmarkStart w:id="37" w:name="ref-luby2022pathway"/>
+    <w:p>
+      <w:pPr>
+        <w:pStyle w:val="Bibliography"/>
+      </w:pPr>
+      <w:r>
+        <w:t xml:space="preserve">Luby, Stephen, and Dorothy L. Southern. 2022.</w:t>
+      </w:r>
+      <w:r>
+        <w:t xml:space="preserve"> </w:t>
+      </w:r>
+      <w:r>
+        <w:rPr>
+          <w:i/>
+          <w:iCs/>
+        </w:rPr>
+        <w:t xml:space="preserve">The Pathway to Publishing: A Guide to Quantitative Writing in the Health Sciences</w:t>
+      </w:r>
+      <w:r>
+        <w:t xml:space="preserve">. Springer International Publishing.</w:t>
+      </w:r>
+      <w:r>
+        <w:t xml:space="preserve"> </w:t>
+      </w:r>
+      <w:hyperlink r:id="rId36">
+        <w:r>
+          <w:rPr>
+            <w:rStyle w:val="Hyperlink"/>
+          </w:rPr>
+          <w:t xml:space="preserve">https://doi.org/10.1007/978-3-030-98175-4</w:t>
+        </w:r>
+      </w:hyperlink>
+      <w:r>
+        <w:t xml:space="preserve">.</w:t>
+      </w:r>
+    </w:p>
+    <w:bookmarkEnd w:id="37"/>
+    <w:bookmarkStart w:id="39" w:name="ref-natphys2007elements"/>
+    <w:p>
+      <w:pPr>
+        <w:pStyle w:val="Bibliography"/>
+      </w:pPr>
+      <w:r>
+        <w:t xml:space="preserve">Nature Physics. 2007.</w:t>
+      </w:r>
+      <w:r>
+        <w:t xml:space="preserve"> </w:t>
+      </w:r>
+      <w:r>
+        <w:t xml:space="preserve">“Elements of Style.”</w:t>
+      </w:r>
+      <w:r>
+        <w:t xml:space="preserve"> </w:t>
+      </w:r>
+      <w:r>
+        <w:rPr>
+          <w:i/>
+          <w:iCs/>
+        </w:rPr>
+        <w:t xml:space="preserve">Nature Physics</w:t>
+      </w:r>
+      <w:r>
+        <w:t xml:space="preserve"> </w:t>
+      </w:r>
+      <w:r>
+        <w:t xml:space="preserve">3: 581.</w:t>
+      </w:r>
+      <w:r>
+        <w:t xml:space="preserve"> </w:t>
+      </w:r>
+      <w:hyperlink r:id="rId38">
+        <w:r>
+          <w:rPr>
+            <w:rStyle w:val="Hyperlink"/>
+          </w:rPr>
+          <w:t xml:space="preserve">https://doi.org/10.1038/nphys724</w:t>
+        </w:r>
+      </w:hyperlink>
+      <w:r>
+        <w:t xml:space="preserve">.</w:t>
+      </w:r>
+    </w:p>
+    <w:bookmarkEnd w:id="39"/>
+    <w:bookmarkStart w:id="41" w:name="ref-savage2019"/>
+    <w:p>
+      <w:pPr>
+        <w:pStyle w:val="Bibliography"/>
+      </w:pPr>
+      <w:r>
+        <w:t xml:space="preserve">Savage, Van, and Pamela Yeh. 2019.</w:t>
+      </w:r>
+      <w:r>
+        <w:t xml:space="preserve"> </w:t>
+      </w:r>
+      <w:r>
+        <w:t xml:space="preserve">“Novelist</w:t>
+      </w:r>
+      <w:r>
+        <w:t xml:space="preserve"> </w:t>
+      </w:r>
+      <w:r>
+        <w:t xml:space="preserve">Cormac McCarthy</w:t>
+      </w:r>
+      <w:r>
+        <w:t xml:space="preserve">’s Tips on How to Write a Great Science Paper.”</w:t>
+      </w:r>
+      <w:r>
+        <w:t xml:space="preserve"> </w:t>
+      </w:r>
+      <w:r>
+        <w:rPr>
+          <w:i/>
+          <w:iCs/>
+        </w:rPr>
+        <w:t xml:space="preserve">Nature</w:t>
+      </w:r>
+      <w:r>
+        <w:t xml:space="preserve"> </w:t>
+      </w:r>
+      <w:r>
+        <w:t xml:space="preserve">574 (7778): 441–42.</w:t>
+      </w:r>
+      <w:r>
+        <w:t xml:space="preserve"> </w:t>
+      </w:r>
+      <w:hyperlink r:id="rId40">
+        <w:r>
+          <w:rPr>
+            <w:rStyle w:val="Hyperlink"/>
+          </w:rPr>
+          <w:t xml:space="preserve">https://doi.org/10.1038/d41586-019-02918-5</w:t>
+        </w:r>
+      </w:hyperlink>
+      <w:r>
+        <w:t xml:space="preserve">.</w:t>
+      </w:r>
+    </w:p>
+    <w:bookmarkEnd w:id="41"/>
+    <w:bookmarkEnd w:id="42"/>
+    <w:bookmarkEnd w:id="43"/>
     <w:sectPr>
       <w:footnotePr>
         <w:numRestart w:val="eachSect"/>
@@ -1111,6 +1552,9 @@
     <w:abstractNumId w:val="991"/>
   </w:num>
   <w:num w:numId="1006">
+    <w:abstractNumId w:val="991"/>
+  </w:num>
+  <w:num w:numId="1007">
     <w:abstractNumId w:val="991"/>
   </w:num>
 </w:numbering>

</xml_diff>

<commit_message>
Deploying to gh-pages from @ Morrison-Lab/psw@ef2ece72cdcd2042e596ae6c7ccf3daa30398dbd 🚀
</commit_message>
<xml_diff>
--- a/chapters/intro.docx
+++ b/chapters/intro.docx
@@ -15,7 +15,7 @@
         <w:pStyle w:val="Date"/>
       </w:pPr>
       <w:r>
-        <w:t xml:space="preserve">Last modified: 2026-10-12 22:10:26 (PDT)</w:t>
+        <w:t xml:space="preserve">Last modified: 2026-10-12 22:48:38 (PDT)</w:t>
       </w:r>
     </w:p>
     <w:tbl>
@@ -566,7 +566,7 @@
           <w:rPr>
             <w:rStyle w:val="Hyperlink"/>
           </w:rPr>
-          <w:t xml:space="preserve">Writing for every reader</w:t>
+          <w:t xml:space="preserve">Avoiding clichés</w:t>
         </w:r>
       </w:hyperlink>
     </w:p>
@@ -583,7 +583,7 @@
           <w:rPr>
             <w:rStyle w:val="Hyperlink"/>
           </w:rPr>
-          <w:t xml:space="preserve">Avoiding AI tells</w:t>
+          <w:t xml:space="preserve">Writing for every reader</w:t>
         </w:r>
       </w:hyperlink>
     </w:p>

</xml_diff>

<commit_message>
Deploying to gh-pages from @ Morrison-Lab/psw@2c06e3bcdc549cbec36c532ab3aeadab7755008f 🚀
</commit_message>
<xml_diff>
--- a/chapters/intro.docx
+++ b/chapters/intro.docx
@@ -15,7 +15,7 @@
         <w:pStyle w:val="Date"/>
       </w:pPr>
       <w:r>
-        <w:t xml:space="preserve">Last modified: 2026-10-15 22:06:09 (PDT)</w:t>
+        <w:t xml:space="preserve">Last modified: 2026-10-15 22:11:04 (PDT)</w:t>
       </w:r>
     </w:p>
     <w:tbl>
@@ -184,7 +184,7 @@
         <w:t xml:space="preserve">Most of its rules apply to any writing that explains technical ideas.</w:t>
       </w:r>
     </w:p>
-    <w:bookmarkStart w:id="15" w:name="what-the-book-covers"/>
+    <w:bookmarkStart w:id="16" w:name="what-the-book-covers"/>
     <w:p>
       <w:pPr>
         <w:pStyle w:val="Heading2"/>
@@ -210,7 +210,7 @@
         <w:t xml:space="preserve"> </w:t>
       </w:r>
       <w:r>
-        <w:t xml:space="preserve">Three chapters cover one kind of document:</w:t>
+        <w:t xml:space="preserve">Four chapters cover one kind of document:</w:t>
       </w:r>
     </w:p>
     <w:p>
@@ -276,8 +276,31 @@
         <w:t xml:space="preserve">covers lecture notes, slides, and problem sets.</w:t>
       </w:r>
     </w:p>
-    <w:bookmarkEnd w:id="15"/>
-    <w:bookmarkStart w:id="17" w:name="who-the-book-is-for"/>
+    <w:p>
+      <w:pPr>
+        <w:pStyle w:val="Compact"/>
+        <w:numPr>
+          <w:ilvl w:val="0"/>
+          <w:numId w:val="1001"/>
+        </w:numPr>
+      </w:pPr>
+      <w:hyperlink r:id="rId15">
+        <w:r>
+          <w:rPr>
+            <w:rStyle w:val="Hyperlink"/>
+          </w:rPr>
+          <w:t xml:space="preserve">Writing for code review and software</w:t>
+        </w:r>
+      </w:hyperlink>
+      <w:r>
+        <w:t xml:space="preserve"> </w:t>
+      </w:r>
+      <w:r>
+        <w:t xml:space="preserve">covers pull requests, issues, commit messages, READMEs, code comments, and release notes.</w:t>
+      </w:r>
+    </w:p>
+    <w:bookmarkEnd w:id="16"/>
+    <w:bookmarkStart w:id="18" w:name="who-the-book-is-for"/>
     <w:p>
       <w:pPr>
         <w:pStyle w:val="Heading2"/>
@@ -346,7 +369,7 @@
       <w:r>
         <w:t xml:space="preserve"> </w:t>
       </w:r>
-      <w:hyperlink r:id="rId16">
+      <w:hyperlink r:id="rId17">
         <w:r>
           <w:rPr>
             <w:rStyle w:val="Hyperlink"/>
@@ -397,8 +420,8 @@
         <w:t xml:space="preserve">without knowing what the paper is about.</w:t>
       </w:r>
     </w:p>
-    <w:bookmarkEnd w:id="17"/>
-    <w:bookmarkStart w:id="27" w:name="how-the-book-is-organized"/>
+    <w:bookmarkEnd w:id="18"/>
+    <w:bookmarkStart w:id="28" w:name="how-the-book-is-organized"/>
     <w:p>
       <w:pPr>
         <w:pStyle w:val="Heading2"/>
@@ -412,7 +435,7 @@
         <w:pStyle w:val="FirstParagraph"/>
       </w:pPr>
       <w:r>
-        <w:t xml:space="preserve">The chapters fall into four groups:</w:t>
+        <w:t xml:space="preserve">The chapters fall into five groups:</w:t>
       </w:r>
     </w:p>
     <w:p>
@@ -435,7 +458,7 @@
           <w:numId w:val="1003"/>
         </w:numPr>
       </w:pPr>
-      <w:hyperlink r:id="rId18">
+      <w:hyperlink r:id="rId19">
         <w:r>
           <w:rPr>
             <w:rStyle w:val="Hyperlink"/>
@@ -452,7 +475,7 @@
           <w:numId w:val="1003"/>
         </w:numPr>
       </w:pPr>
-      <w:hyperlink r:id="rId19">
+      <w:hyperlink r:id="rId20">
         <w:r>
           <w:rPr>
             <w:rStyle w:val="Hyperlink"/>
@@ -469,7 +492,7 @@
           <w:numId w:val="1003"/>
         </w:numPr>
       </w:pPr>
-      <w:hyperlink r:id="rId20">
+      <w:hyperlink r:id="rId21">
         <w:r>
           <w:rPr>
             <w:rStyle w:val="Hyperlink"/>
@@ -544,7 +567,7 @@
           <w:numId w:val="1005"/>
         </w:numPr>
       </w:pPr>
-      <w:hyperlink r:id="rId21">
+      <w:hyperlink r:id="rId22">
         <w:r>
           <w:rPr>
             <w:rStyle w:val="Hyperlink"/>
@@ -561,7 +584,7 @@
           <w:numId w:val="1005"/>
         </w:numPr>
       </w:pPr>
-      <w:hyperlink r:id="rId22">
+      <w:hyperlink r:id="rId23">
         <w:r>
           <w:rPr>
             <w:rStyle w:val="Hyperlink"/>
@@ -578,7 +601,7 @@
           <w:numId w:val="1005"/>
         </w:numPr>
       </w:pPr>
-      <w:hyperlink r:id="rId23">
+      <w:hyperlink r:id="rId24">
         <w:r>
           <w:rPr>
             <w:rStyle w:val="Hyperlink"/>
@@ -595,7 +618,7 @@
           <w:numId w:val="1005"/>
         </w:numPr>
       </w:pPr>
-      <w:hyperlink r:id="rId24">
+      <w:hyperlink r:id="rId25">
         <w:r>
           <w:rPr>
             <w:rStyle w:val="Hyperlink"/>
@@ -612,7 +635,7 @@
           <w:numId w:val="1005"/>
         </w:numPr>
       </w:pPr>
-      <w:hyperlink r:id="rId25">
+      <w:hyperlink r:id="rId26">
         <w:r>
           <w:rPr>
             <w:rStyle w:val="Hyperlink"/>
@@ -652,6 +675,35 @@
     </w:p>
     <w:p>
       <w:pPr>
+        <w:pStyle w:val="Compact"/>
+        <w:numPr>
+          <w:ilvl w:val="0"/>
+          <w:numId w:val="1002"/>
+        </w:numPr>
+      </w:pPr>
+      <w:r>
+        <w:t xml:space="preserve">Software:</w:t>
+      </w:r>
+    </w:p>
+    <w:p>
+      <w:pPr>
+        <w:pStyle w:val="Compact"/>
+        <w:numPr>
+          <w:ilvl w:val="1"/>
+          <w:numId w:val="1007"/>
+        </w:numPr>
+      </w:pPr>
+      <w:hyperlink r:id="rId15">
+        <w:r>
+          <w:rPr>
+            <w:rStyle w:val="Hyperlink"/>
+          </w:rPr>
+          <w:t xml:space="preserve">Writing for code review and software</w:t>
+        </w:r>
+      </w:hyperlink>
+    </w:p>
+    <w:p>
+      <w:pPr>
         <w:pStyle w:val="FirstParagraph"/>
       </w:pPr>
       <w:r>
@@ -660,7 +712,7 @@
       <w:r>
         <w:t xml:space="preserve"> </w:t>
       </w:r>
-      <w:hyperlink r:id="rId26">
+      <w:hyperlink r:id="rId27">
         <w:r>
           <w:rPr>
             <w:rStyle w:val="Hyperlink"/>
@@ -681,8 +733,8 @@
         <w:t xml:space="preserve">as a checklist for revising a draft.</w:t>
       </w:r>
     </w:p>
-    <w:bookmarkEnd w:id="27"/>
-    <w:bookmarkStart w:id="28" w:name="how-to-read-the-book"/>
+    <w:bookmarkEnd w:id="28"/>
+    <w:bookmarkStart w:id="29" w:name="how-to-read-the-book"/>
     <w:p>
       <w:pPr>
         <w:pStyle w:val="Heading2"/>
@@ -731,7 +783,7 @@
       <w:r>
         <w:t xml:space="preserve"> </w:t>
       </w:r>
-      <w:hyperlink r:id="rId21">
+      <w:hyperlink r:id="rId22">
         <w:r>
           <w:rPr>
             <w:rStyle w:val="Hyperlink"/>
@@ -819,7 +871,7 @@
       <w:r>
         <w:t xml:space="preserve"> </w:t>
       </w:r>
-      <w:hyperlink r:id="rId26">
+      <w:hyperlink r:id="rId27">
         <w:r>
           <w:rPr>
             <w:rStyle w:val="Hyperlink"/>
@@ -834,8 +886,8 @@
         <w:t xml:space="preserve">checklist when you revise.</w:t>
       </w:r>
     </w:p>
-    <w:bookmarkEnd w:id="28"/>
-    <w:bookmarkStart w:id="34" w:name="sec-further-reading"/>
+    <w:bookmarkEnd w:id="29"/>
+    <w:bookmarkStart w:id="35" w:name="sec-further-reading"/>
     <w:p>
       <w:pPr>
         <w:pStyle w:val="Heading2"/>
@@ -857,7 +909,7 @@
         <w:pStyle w:val="Compact"/>
         <w:numPr>
           <w:ilvl w:val="0"/>
-          <w:numId w:val="1007"/>
+          <w:numId w:val="1008"/>
         </w:numPr>
       </w:pPr>
       <w:r>
@@ -875,7 +927,7 @@
         <w:pStyle w:val="Compact"/>
         <w:numPr>
           <w:ilvl w:val="0"/>
-          <w:numId w:val="1007"/>
+          <w:numId w:val="1008"/>
         </w:numPr>
       </w:pPr>
       <w:r>
@@ -915,7 +967,7 @@
         <w:pStyle w:val="Compact"/>
         <w:numPr>
           <w:ilvl w:val="0"/>
-          <w:numId w:val="1007"/>
+          <w:numId w:val="1008"/>
         </w:numPr>
       </w:pPr>
       <w:r>
@@ -933,10 +985,10 @@
         <w:pStyle w:val="Compact"/>
         <w:numPr>
           <w:ilvl w:val="0"/>
-          <w:numId w:val="1007"/>
+          <w:numId w:val="1008"/>
         </w:numPr>
       </w:pPr>
-      <w:hyperlink r:id="rId29">
+      <w:hyperlink r:id="rId30">
         <w:r>
           <w:rPr>
             <w:rStyle w:val="Hyperlink"/>
@@ -1020,12 +1072,12 @@
                 <wp:inline>
                   <wp:extent cx="152400" cy="152400"/>
                   <wp:effectExtent b="0" l="0" r="0" t="0"/>
-                  <wp:docPr descr="" title="" id="30" name="Picture"/>
+                  <wp:docPr descr="" title="" id="31" name="Picture"/>
                   <a:graphic>
                     <a:graphicData uri="http://schemas.openxmlformats.org/drawingml/2006/picture">
                       <pic:pic>
                         <pic:nvPicPr>
-                          <pic:cNvPr descr="/opt/quarto/share/formats/docx/note.png" id="31" name="Picture"/>
+                          <pic:cNvPr descr="/opt/quarto/share/formats/docx/note.png" id="32" name="Picture"/>
                           <pic:cNvPicPr>
                             <a:picLocks noChangeArrowheads="1" noChangeAspect="1"/>
                           </pic:cNvPicPr>
@@ -1093,7 +1145,7 @@
             <w:r>
               <w:t xml:space="preserve"> </w:t>
             </w:r>
-            <w:hyperlink r:id="rId32">
+            <w:hyperlink r:id="rId33">
               <w:r>
                 <w:rPr>
                   <w:rStyle w:val="Hyperlink"/>
@@ -1116,7 +1168,7 @@
             <w:r>
               <w:t xml:space="preserve"> </w:t>
             </w:r>
-            <w:hyperlink r:id="rId33">
+            <w:hyperlink r:id="rId34">
               <w:r>
                 <w:rPr>
                   <w:rStyle w:val="Hyperlink"/>
@@ -1135,8 +1187,8 @@
         </w:tc>
       </w:tr>
     </w:tbl>
-    <w:bookmarkEnd w:id="34"/>
-    <w:bookmarkStart w:id="43" w:name="contributing"/>
+    <w:bookmarkEnd w:id="35"/>
+    <w:bookmarkStart w:id="44" w:name="contributing"/>
     <w:p>
       <w:pPr>
         <w:pStyle w:val="Heading2"/>
@@ -1167,7 +1219,7 @@
       <w:r>
         <w:t xml:space="preserve"> </w:t>
       </w:r>
-      <w:hyperlink r:id="rId35">
+      <w:hyperlink r:id="rId36">
         <w:r>
           <w:rPr>
             <w:rStyle w:val="Hyperlink"/>
@@ -1179,8 +1231,8 @@
         <w:t xml:space="preserve">.</w:t>
       </w:r>
     </w:p>
-    <w:bookmarkStart w:id="42" w:name="refs"/>
-    <w:bookmarkStart w:id="37" w:name="ref-luby2022pathway"/>
+    <w:bookmarkStart w:id="43" w:name="refs"/>
+    <w:bookmarkStart w:id="38" w:name="ref-luby2022pathway"/>
     <w:p>
       <w:pPr>
         <w:pStyle w:val="Bibliography"/>
@@ -1204,7 +1256,7 @@
       <w:r>
         <w:t xml:space="preserve"> </w:t>
       </w:r>
-      <w:hyperlink r:id="rId36">
+      <w:hyperlink r:id="rId37">
         <w:r>
           <w:rPr>
             <w:rStyle w:val="Hyperlink"/>
@@ -1216,8 +1268,8 @@
         <w:t xml:space="preserve">.</w:t>
       </w:r>
     </w:p>
-    <w:bookmarkEnd w:id="37"/>
-    <w:bookmarkStart w:id="39" w:name="ref-natphys2007elements"/>
+    <w:bookmarkEnd w:id="38"/>
+    <w:bookmarkStart w:id="40" w:name="ref-natphys2007elements"/>
     <w:p>
       <w:pPr>
         <w:pStyle w:val="Bibliography"/>
@@ -1250,7 +1302,7 @@
       <w:r>
         <w:t xml:space="preserve"> </w:t>
       </w:r>
-      <w:hyperlink r:id="rId38">
+      <w:hyperlink r:id="rId39">
         <w:r>
           <w:rPr>
             <w:rStyle w:val="Hyperlink"/>
@@ -1262,8 +1314,8 @@
         <w:t xml:space="preserve">.</w:t>
       </w:r>
     </w:p>
-    <w:bookmarkEnd w:id="39"/>
-    <w:bookmarkStart w:id="41" w:name="ref-savage2019"/>
+    <w:bookmarkEnd w:id="40"/>
+    <w:bookmarkStart w:id="42" w:name="ref-savage2019"/>
     <w:p>
       <w:pPr>
         <w:pStyle w:val="Bibliography"/>
@@ -1305,7 +1357,7 @@
       <w:r>
         <w:t xml:space="preserve"> </w:t>
       </w:r>
-      <w:hyperlink r:id="rId40">
+      <w:hyperlink r:id="rId41">
         <w:r>
           <w:rPr>
             <w:rStyle w:val="Hyperlink"/>
@@ -1317,9 +1369,9 @@
         <w:t xml:space="preserve">.</w:t>
       </w:r>
     </w:p>
-    <w:bookmarkEnd w:id="41"/>
     <w:bookmarkEnd w:id="42"/>
     <w:bookmarkEnd w:id="43"/>
+    <w:bookmarkEnd w:id="44"/>
     <w:sectPr>
       <w:footnotePr>
         <w:numRestart w:val="eachSect"/>
@@ -1555,6 +1607,9 @@
     <w:abstractNumId w:val="991"/>
   </w:num>
   <w:num w:numId="1007">
+    <w:abstractNumId w:val="991"/>
+  </w:num>
+  <w:num w:numId="1008">
     <w:abstractNumId w:val="991"/>
   </w:num>
 </w:numbering>

</xml_diff>

<commit_message>
Deploying to gh-pages from @ Morrison-Lab/psw@b44c3208a1f021665974303c845b919d80e1eaae 🚀
</commit_message>
<xml_diff>
--- a/chapters/intro.docx
+++ b/chapters/intro.docx
@@ -15,7 +15,7 @@
         <w:pStyle w:val="Date"/>
       </w:pPr>
       <w:r>
-        <w:t xml:space="preserve">Last modified: 2026-10-15 22:11:04 (PDT)</w:t>
+        <w:t xml:space="preserve">Last modified: 2026-10-15 23:26:10 (PDT)</w:t>
       </w:r>
     </w:p>
     <w:tbl>
@@ -421,7 +421,7 @@
       </w:r>
     </w:p>
     <w:bookmarkEnd w:id="18"/>
-    <w:bookmarkStart w:id="28" w:name="how-the-book-is-organized"/>
+    <w:bookmarkStart w:id="29" w:name="how-the-book-is-organized"/>
     <w:p>
       <w:pPr>
         <w:pStyle w:val="Heading2"/>
@@ -435,7 +435,7 @@
         <w:pStyle w:val="FirstParagraph"/>
       </w:pPr>
       <w:r>
-        <w:t xml:space="preserve">The chapters fall into five groups:</w:t>
+        <w:t xml:space="preserve">The chapters fall into six groups:</w:t>
       </w:r>
     </w:p>
     <w:p>
@@ -704,6 +704,35 @@
     </w:p>
     <w:p>
       <w:pPr>
+        <w:pStyle w:val="Compact"/>
+        <w:numPr>
+          <w:ilvl w:val="0"/>
+          <w:numId w:val="1002"/>
+        </w:numPr>
+      </w:pPr>
+      <w:r>
+        <w:t xml:space="preserve">Thinking:</w:t>
+      </w:r>
+    </w:p>
+    <w:p>
+      <w:pPr>
+        <w:pStyle w:val="Compact"/>
+        <w:numPr>
+          <w:ilvl w:val="1"/>
+          <w:numId w:val="1008"/>
+        </w:numPr>
+      </w:pPr>
+      <w:hyperlink r:id="rId27">
+        <w:r>
+          <w:rPr>
+            <w:rStyle w:val="Hyperlink"/>
+          </w:rPr>
+          <w:t xml:space="preserve">Writing to clarify your thinking</w:t>
+        </w:r>
+      </w:hyperlink>
+    </w:p>
+    <w:p>
+      <w:pPr>
         <w:pStyle w:val="FirstParagraph"/>
       </w:pPr>
       <w:r>
@@ -712,7 +741,7 @@
       <w:r>
         <w:t xml:space="preserve"> </w:t>
       </w:r>
-      <w:hyperlink r:id="rId27">
+      <w:hyperlink r:id="rId28">
         <w:r>
           <w:rPr>
             <w:rStyle w:val="Hyperlink"/>
@@ -733,8 +762,8 @@
         <w:t xml:space="preserve">as a checklist for revising a draft.</w:t>
       </w:r>
     </w:p>
-    <w:bookmarkEnd w:id="28"/>
-    <w:bookmarkStart w:id="29" w:name="how-to-read-the-book"/>
+    <w:bookmarkEnd w:id="29"/>
+    <w:bookmarkStart w:id="30" w:name="how-to-read-the-book"/>
     <w:p>
       <w:pPr>
         <w:pStyle w:val="Heading2"/>
@@ -871,7 +900,7 @@
       <w:r>
         <w:t xml:space="preserve"> </w:t>
       </w:r>
-      <w:hyperlink r:id="rId27">
+      <w:hyperlink r:id="rId28">
         <w:r>
           <w:rPr>
             <w:rStyle w:val="Hyperlink"/>
@@ -886,8 +915,8 @@
         <w:t xml:space="preserve">checklist when you revise.</w:t>
       </w:r>
     </w:p>
-    <w:bookmarkEnd w:id="29"/>
-    <w:bookmarkStart w:id="35" w:name="sec-further-reading"/>
+    <w:bookmarkEnd w:id="30"/>
+    <w:bookmarkStart w:id="36" w:name="sec-further-reading"/>
     <w:p>
       <w:pPr>
         <w:pStyle w:val="Heading2"/>
@@ -909,7 +938,7 @@
         <w:pStyle w:val="Compact"/>
         <w:numPr>
           <w:ilvl w:val="0"/>
-          <w:numId w:val="1008"/>
+          <w:numId w:val="1009"/>
         </w:numPr>
       </w:pPr>
       <w:r>
@@ -927,7 +956,7 @@
         <w:pStyle w:val="Compact"/>
         <w:numPr>
           <w:ilvl w:val="0"/>
-          <w:numId w:val="1008"/>
+          <w:numId w:val="1009"/>
         </w:numPr>
       </w:pPr>
       <w:r>
@@ -967,7 +996,7 @@
         <w:pStyle w:val="Compact"/>
         <w:numPr>
           <w:ilvl w:val="0"/>
-          <w:numId w:val="1008"/>
+          <w:numId w:val="1009"/>
         </w:numPr>
       </w:pPr>
       <w:r>
@@ -985,10 +1014,10 @@
         <w:pStyle w:val="Compact"/>
         <w:numPr>
           <w:ilvl w:val="0"/>
-          <w:numId w:val="1008"/>
+          <w:numId w:val="1009"/>
         </w:numPr>
       </w:pPr>
-      <w:hyperlink r:id="rId30">
+      <w:hyperlink r:id="rId31">
         <w:r>
           <w:rPr>
             <w:rStyle w:val="Hyperlink"/>
@@ -1072,12 +1101,12 @@
                 <wp:inline>
                   <wp:extent cx="152400" cy="152400"/>
                   <wp:effectExtent b="0" l="0" r="0" t="0"/>
-                  <wp:docPr descr="" title="" id="31" name="Picture"/>
+                  <wp:docPr descr="" title="" id="32" name="Picture"/>
                   <a:graphic>
                     <a:graphicData uri="http://schemas.openxmlformats.org/drawingml/2006/picture">
                       <pic:pic>
                         <pic:nvPicPr>
-                          <pic:cNvPr descr="/opt/quarto/share/formats/docx/note.png" id="32" name="Picture"/>
+                          <pic:cNvPr descr="/opt/quarto/share/formats/docx/note.png" id="33" name="Picture"/>
                           <pic:cNvPicPr>
                             <a:picLocks noChangeArrowheads="1" noChangeAspect="1"/>
                           </pic:cNvPicPr>
@@ -1145,7 +1174,7 @@
             <w:r>
               <w:t xml:space="preserve"> </w:t>
             </w:r>
-            <w:hyperlink r:id="rId33">
+            <w:hyperlink r:id="rId34">
               <w:r>
                 <w:rPr>
                   <w:rStyle w:val="Hyperlink"/>
@@ -1168,7 +1197,7 @@
             <w:r>
               <w:t xml:space="preserve"> </w:t>
             </w:r>
-            <w:hyperlink r:id="rId34">
+            <w:hyperlink r:id="rId35">
               <w:r>
                 <w:rPr>
                   <w:rStyle w:val="Hyperlink"/>
@@ -1187,8 +1216,8 @@
         </w:tc>
       </w:tr>
     </w:tbl>
-    <w:bookmarkEnd w:id="35"/>
-    <w:bookmarkStart w:id="44" w:name="contributing"/>
+    <w:bookmarkEnd w:id="36"/>
+    <w:bookmarkStart w:id="45" w:name="contributing"/>
     <w:p>
       <w:pPr>
         <w:pStyle w:val="Heading2"/>
@@ -1219,7 +1248,7 @@
       <w:r>
         <w:t xml:space="preserve"> </w:t>
       </w:r>
-      <w:hyperlink r:id="rId36">
+      <w:hyperlink r:id="rId37">
         <w:r>
           <w:rPr>
             <w:rStyle w:val="Hyperlink"/>
@@ -1231,8 +1260,8 @@
         <w:t xml:space="preserve">.</w:t>
       </w:r>
     </w:p>
-    <w:bookmarkStart w:id="43" w:name="refs"/>
-    <w:bookmarkStart w:id="38" w:name="ref-luby2022pathway"/>
+    <w:bookmarkStart w:id="44" w:name="refs"/>
+    <w:bookmarkStart w:id="39" w:name="ref-luby2022pathway"/>
     <w:p>
       <w:pPr>
         <w:pStyle w:val="Bibliography"/>
@@ -1256,7 +1285,7 @@
       <w:r>
         <w:t xml:space="preserve"> </w:t>
       </w:r>
-      <w:hyperlink r:id="rId37">
+      <w:hyperlink r:id="rId38">
         <w:r>
           <w:rPr>
             <w:rStyle w:val="Hyperlink"/>
@@ -1268,8 +1297,8 @@
         <w:t xml:space="preserve">.</w:t>
       </w:r>
     </w:p>
-    <w:bookmarkEnd w:id="38"/>
-    <w:bookmarkStart w:id="40" w:name="ref-natphys2007elements"/>
+    <w:bookmarkEnd w:id="39"/>
+    <w:bookmarkStart w:id="41" w:name="ref-natphys2007elements"/>
     <w:p>
       <w:pPr>
         <w:pStyle w:val="Bibliography"/>
@@ -1302,7 +1331,7 @@
       <w:r>
         <w:t xml:space="preserve"> </w:t>
       </w:r>
-      <w:hyperlink r:id="rId39">
+      <w:hyperlink r:id="rId40">
         <w:r>
           <w:rPr>
             <w:rStyle w:val="Hyperlink"/>
@@ -1314,8 +1343,8 @@
         <w:t xml:space="preserve">.</w:t>
       </w:r>
     </w:p>
-    <w:bookmarkEnd w:id="40"/>
-    <w:bookmarkStart w:id="42" w:name="ref-savage2019"/>
+    <w:bookmarkEnd w:id="41"/>
+    <w:bookmarkStart w:id="43" w:name="ref-savage2019"/>
     <w:p>
       <w:pPr>
         <w:pStyle w:val="Bibliography"/>
@@ -1357,7 +1386,7 @@
       <w:r>
         <w:t xml:space="preserve"> </w:t>
       </w:r>
-      <w:hyperlink r:id="rId41">
+      <w:hyperlink r:id="rId42">
         <w:r>
           <w:rPr>
             <w:rStyle w:val="Hyperlink"/>
@@ -1369,9 +1398,9 @@
         <w:t xml:space="preserve">.</w:t>
       </w:r>
     </w:p>
-    <w:bookmarkEnd w:id="42"/>
     <w:bookmarkEnd w:id="43"/>
     <w:bookmarkEnd w:id="44"/>
+    <w:bookmarkEnd w:id="45"/>
     <w:sectPr>
       <w:footnotePr>
         <w:numRestart w:val="eachSect"/>
@@ -1610,6 +1639,9 @@
     <w:abstractNumId w:val="991"/>
   </w:num>
   <w:num w:numId="1008">
+    <w:abstractNumId w:val="991"/>
+  </w:num>
+  <w:num w:numId="1009">
     <w:abstractNumId w:val="991"/>
   </w:num>
 </w:numbering>

</xml_diff>